<commit_message>
ajoute le nouveau numéro RCCM et les coordonnées ATRIC SARL en en-tête des documents
Ajoute une page d'identification de la société (RCCM RC/YAO/2026/M/344,
capital, adresse, contact) en tête des 3 PDF et du dossier Word ; ajoute
aussi un en-tête Word répété sur chaque page du .docx.

Co-Authored-By: Claude Sonnet 5 <noreply@anthropic.com>
Claude-Session: https://claude.ai/code/session_01B2YQgvJ3KGDDNdJoTwbY3p
</commit_message>
<xml_diff>
--- a/Master_Prompt___Kamili_EduCampus_-_Déploiement_Nat.docx
+++ b/Master_Prompt___Kamili_EduCampus_-_Déploiement_Nat.docx
@@ -2,6 +2,169 @@
 <file path=word/document.xml><?xml version="1.0" encoding="utf-8"?>
 <w:document xmlns:wpc="http://schemas.microsoft.com/office/word/2010/wordprocessingCanvas" xmlns:mc="http://schemas.openxmlformats.org/markup-compatibility/2006" xmlns:o="urn:schemas-microsoft-com:office:office" xmlns:r="http://schemas.openxmlformats.org/officeDocument/2006/relationships" xmlns:m="http://schemas.openxmlformats.org/officeDocument/2006/math" xmlns:v="urn:schemas-microsoft-com:vml" xmlns:wp14="http://schemas.microsoft.com/office/word/2010/wordprocessingDrawing" xmlns:wp="http://schemas.openxmlformats.org/drawingml/2006/wordprocessingDrawing" xmlns:w10="urn:schemas-microsoft-com:office:word" xmlns:w="http://schemas.openxmlformats.org/wordprocessingml/2006/main" xmlns:w14="http://schemas.microsoft.com/office/word/2010/wordml" xmlns:w15="http://schemas.microsoft.com/office/word/2012/wordml" xmlns:wpg="http://schemas.microsoft.com/office/word/2010/wordprocessingGroup" xmlns:wpi="http://schemas.microsoft.com/office/word/2010/wordprocessingInk" xmlns:wne="http://schemas.microsoft.com/office/word/2006/wordml" xmlns:wps="http://schemas.microsoft.com/office/word/2010/wordprocessingShape" xmlns:cx="http://schemas.microsoft.com/office/drawing/2014/chartex" xmlns:cx1="http://schemas.microsoft.com/office/drawing/2015/9/8/chartex" xmlns:cx2="http://schemas.microsoft.com/office/drawing/2015/10/21/chartex" xmlns:cx3="http://schemas.microsoft.com/office/drawing/2016/5/9/chartex" xmlns:cx4="http://schemas.microsoft.com/office/drawing/2016/5/10/chartex" xmlns:cx5="http://schemas.microsoft.com/office/drawing/2016/5/11/chartex" xmlns:cx6="http://schemas.microsoft.com/office/drawing/2016/5/12/chartex" xmlns:cx7="http://schemas.microsoft.com/office/drawing/2016/5/13/chartex" xmlns:cx8="http://schemas.microsoft.com/office/drawing/2016/5/14/chartex" xmlns:aink="http://schemas.microsoft.com/office/drawing/2016/ink" xmlns:am3d="http://schemas.microsoft.com/office/drawing/2017/model3d" xmlns:w16cex="http://schemas.microsoft.com/office/word/2018/wordml/cex" xmlns:w16cid="http://schemas.microsoft.com/office/word/2016/wordml/cid" xmlns:w16="http://schemas.microsoft.com/office/word/2018/wordml" xmlns:w16sdtdh="http://schemas.microsoft.com/office/word/2020/wordml/sdtdatahash" xmlns:w16se="http://schemas.microsoft.com/office/word/2015/wordml/symex" mc:Ignorable="w14 w15 wp14">
   <w:body>
+    <w:p>
+      <w:pPr>
+        <w:spacing w:after="40"/>
+        <w:jc w:val="center"/>
+      </w:pPr>
+      <w:r>
+        <w:rPr>
+          <w:b/>
+          <w:i w:val="0"/>
+          <w:color w:val="C88A1E"/>
+          <w:sz w:val="18"/>
+        </w:rPr>
+        <w:t>EN-TÊTE OFFICIEL — IDENTIFICATION DE LA SOCIÉTÉ</w:t>
+      </w:r>
+    </w:p>
+    <w:p>
+      <w:pPr>
+        <w:spacing w:after="40"/>
+        <w:jc w:val="center"/>
+      </w:pPr>
+      <w:r>
+        <w:rPr>
+          <w:b/>
+          <w:i w:val="0"/>
+          <w:color w:val="7E1A31"/>
+          <w:sz w:val="30"/>
+        </w:rPr>
+        <w:t>AFRICAN TRADE AND INDUSTRY COMPANY</w:t>
+      </w:r>
+    </w:p>
+    <w:p>
+      <w:pPr>
+        <w:spacing w:after="40"/>
+        <w:jc w:val="center"/>
+      </w:pPr>
+      <w:r>
+        <w:rPr>
+          <w:b/>
+          <w:i w:val="0"/>
+          <w:color w:val="7E1A31"/>
+          <w:sz w:val="40"/>
+        </w:rPr>
+        <w:t>ATRIC SARL</w:t>
+      </w:r>
+    </w:p>
+    <w:p>
+      <w:pPr>
+        <w:spacing w:after="40"/>
+        <w:jc w:val="center"/>
+      </w:pPr>
+      <w:r>
+        <w:rPr>
+          <w:b w:val="0"/>
+          <w:i/>
+          <w:color w:val="C88A1E"/>
+          <w:sz w:val="24"/>
+        </w:rPr>
+        <w:t>African Industrial &amp; Business Solutions</w:t>
+      </w:r>
+    </w:p>
+    <w:p>
+      <w:pPr>
+        <w:spacing w:after="40"/>
+        <w:jc w:val="center"/>
+      </w:pPr>
+      <w:r>
+        <w:rPr>
+          <w:b w:val="0"/>
+          <w:i w:val="0"/>
+          <w:sz w:val="12"/>
+        </w:rPr>
+      </w:r>
+    </w:p>
+    <w:p>
+      <w:pPr>
+        <w:spacing w:after="40"/>
+        <w:jc w:val="center"/>
+      </w:pPr>
+      <w:r>
+        <w:rPr>
+          <w:b w:val="0"/>
+          <w:i w:val="0"/>
+          <w:sz w:val="21"/>
+        </w:rPr>
+        <w:t>Société à Responsabilité Limitée au capital de 990 000 FCFA</w:t>
+      </w:r>
+    </w:p>
+    <w:p>
+      <w:pPr>
+        <w:spacing w:after="40"/>
+        <w:jc w:val="center"/>
+      </w:pPr>
+      <w:r>
+        <w:rPr>
+          <w:b/>
+          <w:i w:val="0"/>
+          <w:color w:val="7E1A31"/>
+          <w:sz w:val="24"/>
+        </w:rPr>
+        <w:t>RCCM : RC/YAO/2026/M/344</w:t>
+      </w:r>
+    </w:p>
+    <w:p>
+      <w:pPr>
+        <w:spacing w:after="40"/>
+        <w:jc w:val="center"/>
+      </w:pPr>
+      <w:r>
+        <w:rPr>
+          <w:b w:val="0"/>
+          <w:i w:val="0"/>
+          <w:sz w:val="21"/>
+        </w:rPr>
+        <w:t>📍 Yaoundé – Cameroun</w:t>
+      </w:r>
+    </w:p>
+    <w:p>
+      <w:pPr>
+        <w:spacing w:after="40"/>
+        <w:jc w:val="center"/>
+      </w:pPr>
+      <w:r>
+        <w:rPr>
+          <w:b w:val="0"/>
+          <w:i w:val="0"/>
+          <w:sz w:val="21"/>
+        </w:rPr>
+        <w:t>☎️ Tél. : +237 620 71 90 40</w:t>
+      </w:r>
+    </w:p>
+    <w:p>
+      <w:pPr>
+        <w:spacing w:after="40"/>
+        <w:jc w:val="center"/>
+      </w:pPr>
+      <w:r>
+        <w:rPr>
+          <w:b w:val="0"/>
+          <w:i w:val="0"/>
+          <w:sz w:val="21"/>
+        </w:rPr>
+        <w:t>✉️ Email : contact@atricsarl.com</w:t>
+      </w:r>
+    </w:p>
+    <w:p>
+      <w:pPr>
+        <w:spacing w:after="40"/>
+        <w:jc w:val="center"/>
+      </w:pPr>
+      <w:r>
+        <w:rPr>
+          <w:b w:val="0"/>
+          <w:i w:val="0"/>
+          <w:sz w:val="21"/>
+        </w:rPr>
+        <w:t>🌐 www.atricsarl.com</w:t>
+      </w:r>
+    </w:p>
+    <w:p>
+      <w:r>
+        <w:br w:type="page"/>
+      </w:r>
+    </w:p>
     <w:p>
       <w:pPr>
         <w:pStyle w:val="Title"/>
@@ -4733,6 +4896,7 @@
       </w:r>
     </w:p>
     <w:sectPr>
+      <w:headerReference w:type="default" r:id="rId7"/>
       <w:pgSz w:w="11906" w:h="16838" w:orient="portrait"/>
       <w:pgMar w:top="1440" w:right="1440" w:bottom="1440" w:left="1440" w:header="708" w:footer="708" w:gutter="0"/>
       <w:pgNumType/>
@@ -4781,6 +4945,26 @@
     </w:p>
   </w:footnote>
 </w:footnotes>
+</file>
+
+<file path=word/header1.xml><?xml version="1.0" encoding="utf-8"?>
+<w:hdr xmlns:m="http://schemas.openxmlformats.org/officeDocument/2006/math" xmlns:mc="http://schemas.openxmlformats.org/markup-compatibility/2006" xmlns:mo="http://schemas.microsoft.com/office/mac/office/2008/main" xmlns:mv="urn:schemas-microsoft-com:mac:vml" xmlns:o="urn:schemas-microsoft-com:office:office" xmlns:r="http://schemas.openxmlformats.org/officeDocument/2006/relationships" xmlns:v="urn:schemas-microsoft-com:vml" xmlns:w10="urn:schemas-microsoft-com:office:word" xmlns:w14="http://schemas.microsoft.com/office/word/2010/wordml" xmlns:w="http://schemas.openxmlformats.org/wordprocessingml/2006/main" xmlns:wne="http://schemas.microsoft.com/office/word/2006/wordml" xmlns:wp14="http://schemas.microsoft.com/office/word/2010/wordprocessingDrawing" xmlns:wp="http://schemas.openxmlformats.org/drawingml/2006/wordprocessingDrawing" xmlns:wpc="http://schemas.microsoft.com/office/word/2010/wordprocessingCanvas" xmlns:wpg="http://schemas.microsoft.com/office/word/2010/wordprocessingGroup" xmlns:wpi="http://schemas.microsoft.com/office/word/2010/wordprocessingInk" xmlns:wps="http://schemas.microsoft.com/office/word/2010/wordprocessingShape" mc:Ignorable="w14 wp14">
+  <w:p>
+    <w:pPr>
+      <w:pStyle w:val="Header"/>
+      <w:jc w:val="center"/>
+    </w:pPr>
+    <w:r/>
+    <w:r>
+      <w:rPr>
+        <w:i/>
+        <w:color w:val="666666"/>
+        <w:sz w:val="16"/>
+      </w:rPr>
+      <w:t>ATRIC SARL — RCCM : RC/YAO/2026/M/344 — Yaoundé, Cameroun — www.atricsarl.com</w:t>
+    </w:r>
+  </w:p>
+</w:hdr>
 </file>
 
 <file path=word/numbering.xml><?xml version="1.0" encoding="utf-8"?>

</xml_diff>

<commit_message>
ajoute le logo Kamili Edu Campus à la maquette et aux documents PDF/Word
Remplace le badge texte "K" par le vrai logo dans le favicon, la page
de connexion, la page d'accueil et les 6 sidebars des espaces. Insère
aussi le logo sur la page de garde des 3 PDF et dans l'en-tête + la
page de garde du dossier Word.

Co-Authored-By: Claude Sonnet 5 <noreply@anthropic.com>
Claude-Session: https://claude.ai/code/session_01DEQ7S35fENUd8qfUz95QZ2
</commit_message>
<xml_diff>
--- a/Master_Prompt___Kamili_EduCampus_-_Déploiement_Nat.docx
+++ b/Master_Prompt___Kamili_EduCampus_-_Déploiement_Nat.docx
@@ -163,6 +163,45 @@
     <w:p>
       <w:r>
         <w:br w:type="page"/>
+      </w:r>
+    </w:p>
+    <w:p>
+      <w:pPr>
+        <w:jc w:val="center"/>
+      </w:pPr>
+      <w:r>
+        <w:drawing>
+          <wp:inline xmlns:a="http://schemas.openxmlformats.org/drawingml/2006/main" xmlns:pic="http://schemas.openxmlformats.org/drawingml/2006/picture">
+            <wp:extent cx="1188720" cy="648224"/>
+            <wp:docPr id="1" name="Picture 1"/>
+            <wp:cNvGraphicFramePr>
+              <a:graphicFrameLocks noChangeAspect="1"/>
+            </wp:cNvGraphicFramePr>
+            <a:graphic>
+              <a:graphicData uri="http://schemas.openxmlformats.org/drawingml/2006/picture">
+                <pic:pic>
+                  <pic:nvPicPr>
+                    <pic:cNvPr id="0" name="logo.jpeg"/>
+                    <pic:cNvPicPr/>
+                  </pic:nvPicPr>
+                  <pic:blipFill>
+                    <a:blip r:embed="rId8"/>
+                    <a:stretch>
+                      <a:fillRect/>
+                    </a:stretch>
+                  </pic:blipFill>
+                  <pic:spPr>
+                    <a:xfrm>
+                      <a:off x="0" y="0"/>
+                      <a:ext cx="1188720" cy="648224"/>
+                    </a:xfrm>
+                    <a:prstGeom prst="rect"/>
+                  </pic:spPr>
+                </pic:pic>
+              </a:graphicData>
+            </a:graphic>
+          </wp:inline>
+        </w:drawing>
       </w:r>
     </w:p>
     <w:p>
@@ -4950,6 +4989,40 @@
 <file path=word/header1.xml><?xml version="1.0" encoding="utf-8"?>
 <w:hdr xmlns:m="http://schemas.openxmlformats.org/officeDocument/2006/math" xmlns:mc="http://schemas.openxmlformats.org/markup-compatibility/2006" xmlns:mo="http://schemas.microsoft.com/office/mac/office/2008/main" xmlns:mv="urn:schemas-microsoft-com:mac:vml" xmlns:o="urn:schemas-microsoft-com:office:office" xmlns:r="http://schemas.openxmlformats.org/officeDocument/2006/relationships" xmlns:v="urn:schemas-microsoft-com:vml" xmlns:w10="urn:schemas-microsoft-com:office:word" xmlns:w14="http://schemas.microsoft.com/office/word/2010/wordml" xmlns:w="http://schemas.openxmlformats.org/wordprocessingml/2006/main" xmlns:wne="http://schemas.microsoft.com/office/word/2006/wordml" xmlns:wp14="http://schemas.microsoft.com/office/word/2010/wordprocessingDrawing" xmlns:wp="http://schemas.openxmlformats.org/drawingml/2006/wordprocessingDrawing" xmlns:wpc="http://schemas.microsoft.com/office/word/2010/wordprocessingCanvas" xmlns:wpg="http://schemas.microsoft.com/office/word/2010/wordprocessingGroup" xmlns:wpi="http://schemas.microsoft.com/office/word/2010/wordprocessingInk" xmlns:wps="http://schemas.microsoft.com/office/word/2010/wordprocessingShape" mc:Ignorable="w14 wp14">
   <w:p>
+    <w:r>
+      <w:drawing>
+        <wp:inline xmlns:a="http://schemas.openxmlformats.org/drawingml/2006/main" xmlns:pic="http://schemas.openxmlformats.org/drawingml/2006/picture">
+          <wp:extent cx="326052" cy="177800"/>
+          <wp:docPr id="1" name="Picture 1"/>
+          <wp:cNvGraphicFramePr>
+            <a:graphicFrameLocks noChangeAspect="1"/>
+          </wp:cNvGraphicFramePr>
+          <a:graphic>
+            <a:graphicData uri="http://schemas.openxmlformats.org/drawingml/2006/picture">
+              <pic:pic>
+                <pic:nvPicPr>
+                  <pic:cNvPr id="0" name="logo.jpeg"/>
+                  <pic:cNvPicPr/>
+                </pic:nvPicPr>
+                <pic:blipFill>
+                  <a:blip r:embed="rId1"/>
+                  <a:stretch>
+                    <a:fillRect/>
+                  </a:stretch>
+                </pic:blipFill>
+                <pic:spPr>
+                  <a:xfrm>
+                    <a:off x="0" y="0"/>
+                    <a:ext cx="326052" cy="177800"/>
+                  </a:xfrm>
+                  <a:prstGeom prst="rect"/>
+                </pic:spPr>
+              </pic:pic>
+            </a:graphicData>
+          </a:graphic>
+        </wp:inline>
+      </w:drawing>
+    </w:r>
     <w:pPr>
       <w:pStyle w:val="Header"/>
       <w:jc w:val="center"/>

</xml_diff>